<commit_message>
ARC-17: Keycloak as the only identity provider for application users (ADR-0017); SRS v0.96
</commit_message>
<xml_diff>
--- a/docs/06-testing/dist/SHP_Master_Test_Plan_v0.9.docx
+++ b/docs/06-testing/dist/SHP_Master_Test_Plan_v0.9.docx
@@ -62,7 +62,7 @@
           <w:i w:val="0"/>
           <w:sz w:val="24"/>
         </w:rPr>
-        <w:t>Dựa trên Đặc tả yêu cầu phần mềm v0.95</w:t>
+        <w:t>Dựa trên Đặc tả yêu cầu phần mềm v0.96</w:t>
       </w:r>
     </w:p>
     <w:p/>
@@ -164,7 +164,7 @@
           <w:b w:val="0"/>
           <w:i w:val="0"/>
         </w:rPr>
-        <w:t>Tài liệu này mô tả cách nhóm kiểm thử Smart Hospital Platform để chứng minh từng yêu cầu trong SRS v0.95 được đáp ứng: phạm vi, chiến lược theo rủi ro, các mức và loại kiểm thử, môi trường, công cụ, tiêu chí vào/ra, quy trình xử lý lỗi, và cách tích hợp vào CI/CD. Hệ thống xử lý dữ liệu sức khỏe nên bảo mật và quyền riêng tư là rủi ro số một: không phát hành khi còn một test bảo mật mức P0 thất bại.</w:t>
+        <w:t>Tài liệu này mô tả cách nhóm kiểm thử Smart Hospital Platform để chứng minh từng yêu cầu trong SRS v0.96 được đáp ứng: phạm vi, chiến lược theo rủi ro, các mức và loại kiểm thử, môi trường, công cụ, tiêu chí vào/ra, quy trình xử lý lỗi, và cách tích hợp vào CI/CD. Hệ thống xử lý dữ liệu sức khỏe nên bảo mật và quyền riêng tư là rủi ro số một: không phát hành khi còn một test bảo mật mức P0 thất bại.</w:t>
       </w:r>
     </w:p>
     <w:p>
@@ -5511,7 +5511,7 @@
           <w:b w:val="0"/>
           <w:i w:val="0"/>
         </w:rPr>
-        <w:t>Số liệu sinh tự động từ danh mục test case (SRS v0.95). Chi tiết từng test case và ma trận truy vết: Test_Cases.xlsx và docs/06-testing/traceability.md.</w:t>
+        <w:t>Số liệu sinh tự động từ danh mục test case (SRS v0.96). Chi tiết từng test case và ma trận truy vết: Test_Cases.xlsx và docs/06-testing/traceability.md.</w:t>
       </w:r>
     </w:p>
     <w:tbl>
@@ -5603,7 +5603,7 @@
                 <w:b w:val="0"/>
                 <w:sz w:val="19"/>
               </w:rPr>
-              <w:t>180</w:t>
+              <w:t>181</w:t>
             </w:r>
           </w:p>
         </w:tc>
@@ -5641,7 +5641,7 @@
                 <w:b w:val="0"/>
                 <w:sz w:val="19"/>
               </w:rPr>
-              <w:t>105</w:t>
+              <w:t>106</w:t>
             </w:r>
           </w:p>
         </w:tc>
@@ -5679,7 +5679,7 @@
                 <w:b w:val="0"/>
                 <w:sz w:val="19"/>
               </w:rPr>
-              <w:t>38 (21%)</w:t>
+              <w:t>38 (20%)</w:t>
             </w:r>
           </w:p>
         </w:tc>
@@ -5755,7 +5755,7 @@
                 <w:b w:val="0"/>
                 <w:sz w:val="19"/>
               </w:rPr>
-              <w:t>25 / 105</w:t>
+              <w:t>25 / 106</w:t>
             </w:r>
           </w:p>
         </w:tc>
@@ -6049,7 +6049,7 @@
                 <w:b w:val="0"/>
                 <w:sz w:val="19"/>
               </w:rPr>
-              <w:t>23</w:t>
+              <w:t>24</w:t>
             </w:r>
           </w:p>
         </w:tc>
@@ -6103,7 +6103,7 @@
                 <w:b w:val="0"/>
                 <w:sz w:val="19"/>
               </w:rPr>
-              <w:t>23</w:t>
+              <w:t>24</w:t>
             </w:r>
           </w:p>
         </w:tc>

</xml_diff>

<commit_message>
ARC-17: sign-up by phone or email; national ID (CCCD) added at the visit with consent, encrypted and masked (UC supplement-national-id, US-075)
</commit_message>
<xml_diff>
--- a/docs/06-testing/dist/SHP_Master_Test_Plan_v0.9.docx
+++ b/docs/06-testing/dist/SHP_Master_Test_Plan_v0.9.docx
@@ -294,7 +294,7 @@
                 <w:b w:val="0"/>
                 <w:sz w:val="18"/>
               </w:rPr>
-              <w:t>52 use case của SRS (6 module) và 90 tiêu chí nghiệm thu Given/When/Then</w:t>
+              <w:t>53 use case của SRS (6 module) và 95 tiêu chí nghiệm thu Given/When/Then</w:t>
             </w:r>
           </w:p>
         </w:tc>
@@ -5603,7 +5603,7 @@
                 <w:b w:val="0"/>
                 <w:sz w:val="19"/>
               </w:rPr>
-              <w:t>181</w:t>
+              <w:t>185</w:t>
             </w:r>
           </w:p>
         </w:tc>
@@ -5641,7 +5641,7 @@
                 <w:b w:val="0"/>
                 <w:sz w:val="19"/>
               </w:rPr>
-              <w:t>106</w:t>
+              <w:t>109</w:t>
             </w:r>
           </w:p>
         </w:tc>
@@ -5755,7 +5755,7 @@
                 <w:b w:val="0"/>
                 <w:sz w:val="19"/>
               </w:rPr>
-              <w:t>25 / 106</w:t>
+              <w:t>25 / 109</w:t>
             </w:r>
           </w:p>
         </w:tc>
@@ -6049,7 +6049,7 @@
                 <w:b w:val="0"/>
                 <w:sz w:val="19"/>
               </w:rPr>
-              <w:t>24</w:t>
+              <w:t>28</w:t>
             </w:r>
           </w:p>
         </w:tc>
@@ -6103,7 +6103,7 @@
                 <w:b w:val="0"/>
                 <w:sz w:val="19"/>
               </w:rPr>
-              <w:t>24</w:t>
+              <w:t>28</w:t>
             </w:r>
           </w:p>
         </w:tc>

</xml_diff>

<commit_message>
ARC-17: family profiles, claim existing record, shared OTP service (Zalo first, SMS fallback) - ADR-0018, SRS v0.96, APIs C22-C29 and N8-N9, authz predicates, plan and tests
</commit_message>
<xml_diff>
--- a/docs/06-testing/dist/SHP_Master_Test_Plan_v0.9.docx
+++ b/docs/06-testing/dist/SHP_Master_Test_Plan_v0.9.docx
@@ -294,7 +294,7 @@
                 <w:b w:val="0"/>
                 <w:sz w:val="18"/>
               </w:rPr>
-              <w:t>53 use case của SRS (6 module) và 95 tiêu chí nghiệm thu Given/When/Then</w:t>
+              <w:t>57 use case của SRS (6 module) và 112 tiêu chí nghiệm thu Given/When/Then</w:t>
             </w:r>
           </w:p>
         </w:tc>
@@ -5603,7 +5603,7 @@
                 <w:b w:val="0"/>
                 <w:sz w:val="19"/>
               </w:rPr>
-              <w:t>185</w:t>
+              <w:t>202</w:t>
             </w:r>
           </w:p>
         </w:tc>
@@ -5641,7 +5641,7 @@
                 <w:b w:val="0"/>
                 <w:sz w:val="19"/>
               </w:rPr>
-              <w:t>109</w:t>
+              <w:t>121</w:t>
             </w:r>
           </w:p>
         </w:tc>
@@ -5679,7 +5679,7 @@
                 <w:b w:val="0"/>
                 <w:sz w:val="19"/>
               </w:rPr>
-              <w:t>38 (20%)</w:t>
+              <w:t>38 (18%)</w:t>
             </w:r>
           </w:p>
         </w:tc>
@@ -5755,7 +5755,7 @@
                 <w:b w:val="0"/>
                 <w:sz w:val="19"/>
               </w:rPr>
-              <w:t>25 / 109</w:t>
+              <w:t>25 / 121</w:t>
             </w:r>
           </w:p>
         </w:tc>
@@ -6049,7 +6049,7 @@
                 <w:b w:val="0"/>
                 <w:sz w:val="19"/>
               </w:rPr>
-              <w:t>28</w:t>
+              <w:t>44</w:t>
             </w:r>
           </w:p>
         </w:tc>
@@ -6103,7 +6103,7 @@
                 <w:b w:val="0"/>
                 <w:sz w:val="19"/>
               </w:rPr>
-              <w:t>28</w:t>
+              <w:t>44</w:t>
             </w:r>
           </w:p>
         </w:tc>
@@ -6489,7 +6489,7 @@
                 <w:b w:val="0"/>
                 <w:sz w:val="19"/>
               </w:rPr>
-              <w:t>20</w:t>
+              <w:t>21</w:t>
             </w:r>
           </w:p>
         </w:tc>
@@ -6543,7 +6543,7 @@
                 <w:b w:val="0"/>
                 <w:sz w:val="19"/>
               </w:rPr>
-              <w:t>11</w:t>
+              <w:t>12</w:t>
             </w:r>
           </w:p>
         </w:tc>

</xml_diff>